<commit_message>
Update published 30-day readmission results.docx
</commit_message>
<xml_diff>
--- a/published readmission results/published 30-day readmission results.docx
+++ b/published readmission results/published 30-day readmission results.docx
@@ -90,6 +90,7 @@
                 <w:id w:val="951975459"/>
                 <w:citation/>
               </w:sdtPr>
+              <w:sdtEndPr/>
               <w:sdtContent>
                 <w:r>
                   <w:fldChar w:fldCharType="begin"/>
@@ -142,8 +143,13 @@
           </w:tcPr>
           <w:p>
             <w:r>
-              <w:t>0.667 XGBoost</w:t>
-            </w:r>
+              <w:t xml:space="preserve">0.667 </w:t>
+            </w:r>
+            <w:proofErr w:type="spellStart"/>
+            <w:r>
+              <w:t>XGBoost</w:t>
+            </w:r>
+            <w:proofErr w:type="spellEnd"/>
           </w:p>
         </w:tc>
         <w:tc>
@@ -178,6 +184,7 @@
                 <w:id w:val="1262720525"/>
                 <w:citation/>
               </w:sdtPr>
+              <w:sdtEndPr/>
               <w:sdtContent>
                 <w:r>
                   <w:fldChar w:fldCharType="begin"/>
@@ -230,8 +237,13 @@
           </w:tcPr>
           <w:p>
             <w:r>
-              <w:t>0.64 XGBoost</w:t>
-            </w:r>
+              <w:t xml:space="preserve">0.64 </w:t>
+            </w:r>
+            <w:proofErr w:type="spellStart"/>
+            <w:r>
+              <w:t>XGBoost</w:t>
+            </w:r>
+            <w:proofErr w:type="spellEnd"/>
           </w:p>
         </w:tc>
         <w:tc>
@@ -266,6 +278,7 @@
                 <w:id w:val="24834391"/>
                 <w:citation/>
               </w:sdtPr>
+              <w:sdtEndPr/>
               <w:sdtContent>
                 <w:r>
                   <w:fldChar w:fldCharType="begin"/>
@@ -354,6 +367,7 @@
                 <w:id w:val="505325346"/>
                 <w:citation/>
               </w:sdtPr>
+              <w:sdtEndPr/>
               <w:sdtContent>
                 <w:r>
                   <w:fldChar w:fldCharType="begin"/>
@@ -471,7 +485,15 @@
           </w:tcPr>
           <w:p>
             <w:r>
-              <w:t>EBM- 0.66. XGBoost – 0.67, PLR – 0.65</w:t>
+              <w:t xml:space="preserve">EBM- 0.66. </w:t>
+            </w:r>
+            <w:proofErr w:type="spellStart"/>
+            <w:r>
+              <w:t>XGBoost</w:t>
+            </w:r>
+            <w:proofErr w:type="spellEnd"/>
+            <w:r>
+              <w:t xml:space="preserve"> – 0.67, PLR – 0.65</w:t>
             </w:r>
           </w:p>
         </w:tc>
@@ -481,7 +503,15 @@
           </w:tcPr>
           <w:p>
             <w:r>
-              <w:t>PLR – 0.21, XGBoost – 0.22, EBM – 0.21</w:t>
+              <w:t xml:space="preserve">PLR – 0.21, </w:t>
+            </w:r>
+            <w:proofErr w:type="spellStart"/>
+            <w:r>
+              <w:t>XGBoost</w:t>
+            </w:r>
+            <w:proofErr w:type="spellEnd"/>
+            <w:r>
+              <w:t xml:space="preserve"> – 0.22, EBM – 0.21</w:t>
             </w:r>
           </w:p>
         </w:tc>
@@ -501,20 +531,19 @@
     <w:p/>
     <w:sdt>
       <w:sdtPr>
+        <w:rPr>
+          <w:rFonts w:asciiTheme="minorHAnsi" w:eastAsiaTheme="minorHAnsi" w:hAnsiTheme="minorHAnsi" w:cstheme="minorBidi"/>
+          <w:color w:val="auto"/>
+          <w:sz w:val="24"/>
+          <w:szCs w:val="24"/>
+        </w:rPr>
         <w:id w:val="-1685427268"/>
         <w:docPartObj>
           <w:docPartGallery w:val="Bibliographies"/>
           <w:docPartUnique/>
         </w:docPartObj>
       </w:sdtPr>
-      <w:sdtEndPr>
-        <w:rPr>
-          <w:rFonts w:asciiTheme="minorHAnsi" w:eastAsiaTheme="minorHAnsi" w:hAnsiTheme="minorHAnsi" w:cstheme="minorBidi"/>
-          <w:color w:val="auto"/>
-          <w:sz w:val="24"/>
-          <w:szCs w:val="24"/>
-        </w:rPr>
-      </w:sdtEndPr>
+      <w:sdtEndPr/>
       <w:sdtContent>
         <w:p>
           <w:pPr>
@@ -529,6 +558,7 @@
             <w:id w:val="-573587230"/>
             <w:bibliography/>
           </w:sdtPr>
+          <w:sdtEndPr/>
           <w:sdtContent>
             <w:p>
               <w:pPr>
@@ -1299,6 +1329,7 @@
   <w:style w:type="character" w:default="1" w:styleId="DefaultParagraphFont">
     <w:name w:val="Default Paragraph Font"/>
     <w:uiPriority w:val="1"/>
+    <w:semiHidden/>
     <w:unhideWhenUsed/>
   </w:style>
   <w:style w:type="table" w:default="1" w:styleId="TableNormal">

</xml_diff>